<commit_message>
docs: brief i załącznik 1 po korekcie modelu
Nowa kwota firmy przykładowej i opis korekty z 3 października 2026.

Co-Authored-By: Claude Fable 5.1 <noreply@anthropic.com>
Claude-Session: https://claude.ai/code/session_019nwbTaAEM1FBmbru1gVRPW
</commit_message>
<xml_diff>
--- a/docs/dla-fundacji/Zalacznik-1-Zalozenia-Kalkulatora.docx
+++ b/docs/dla-fundacji/Zalacznik-1-Zalozenia-Kalkulatora.docx
@@ -54,10 +54,10 @@
         <w:rPr>
           <w:b/>
         </w:rPr>
-        <w:t>3,32 mln zł, czyli 3,32% przychodu</w:t>
+        <w:t>3,12 mln zł, czyli 3,12% przychodu</w:t>
       </w:r>
       <w:r>
-        <w:t>; granice scenariusza 2,51–4,21 mln zł. Na sumę składają się: błędy i compliance 1,10 mln zł, rotacja i utrata wiedzy 0,74 mln zł, wypalenie i pasywność 1,48 mln zł. Dwa pozostałe obszary (innowacje i uczenie się, koordynacja i hierarchia) są pokazywane poza sumą, bez dodawania złotych.</w:t>
+        <w:t>; granice scenariusza 2,36–3,94 mln zł. Na sumę składają się: błędy i compliance 1,04 mln zł, rotacja i utrata wiedzy 0,73 mln zł, wypalenie i pasywność 1,35 mln zł. (Przed korektą modelu z 3 października 2026 r. było to 3,32 mln zł; opis zmian w sekcji 7.) Dwa pozostałe obszary (innowacje i uczenie się, koordynacja i hierarchia) są pokazywane poza sumą, bez dodawania złotych.</w:t>
       </w:r>
     </w:p>
     <w:p>
@@ -465,7 +465,7 @@
               <w:rPr>
                 <w:sz w:val="19"/>
               </w:rPr>
-              <w:t>Definicja i tabela źródłowa niepotwierdzone. Inna publikacja podaje 19,7% (zwolnienia), więc nie zamieniamy automatycznie.</w:t>
+              <w:t>Używane tylko wtedy, gdy firma nie poda rotacji. Definicja i tabela źródłowa niepotwierdzone; inna publikacja podaje 19,7% (zwolnienia).</w:t>
             </w:r>
           </w:p>
         </w:tc>
@@ -485,7 +485,7 @@
               <w:rPr>
                 <w:sz w:val="19"/>
               </w:rPr>
-              <w:t>Połączenie informacji o rotacji</w:t>
+              <w:t>Rotacja: sygnał klimatu i deklaracja</w:t>
             </w:r>
           </w:p>
         </w:tc>
@@ -503,7 +503,7 @@
               <w:rPr>
                 <w:sz w:val="19"/>
               </w:rPr>
-              <w:t>50% sygnału klimatu, 50% deklaracji</w:t>
+              <w:t>połowa sygnału klimatu; deklarowana rotacja jest tylko górnym ograniczeniem</w:t>
             </w:r>
           </w:p>
         </w:tc>
@@ -521,7 +521,7 @@
               <w:rPr>
                 <w:sz w:val="19"/>
               </w:rPr>
-              <w:t>Autorski prior</w:t>
+              <w:t>Autorski prior (waga 0,5)</w:t>
             </w:r>
           </w:p>
         </w:tc>
@@ -539,7 +539,7 @@
               <w:rPr>
                 <w:sz w:val="19"/>
               </w:rPr>
-              <w:t>Zmniejsza zależność od jednego suwaka. Nie dowodzi przyczyny odejść.</w:t>
+              <w:t>Rotacja ponad odniesienie nie jest przypisywana milczeniu. Nie dowodzi przyczyny odejść.</w:t>
             </w:r>
           </w:p>
         </w:tc>
@@ -836,6 +836,154 @@
                 <w:sz w:val="19"/>
               </w:rPr>
               <w:t>Założenie o przeniesieniu mechanizmu, nie oszacowana wielkość.</w:t>
+            </w:r>
+          </w:p>
+        </w:tc>
+      </w:tr>
+      <w:tr>
+        <w:tc>
+          <w:tcPr>
+            <w:tcW w:type="dxa" w:w="2268"/>
+          </w:tcPr>
+          <w:p>
+            <w:r>
+              <w:rPr>
+                <w:sz w:val="19"/>
+              </w:rPr>
+            </w:r>
+            <w:r>
+              <w:rPr>
+                <w:sz w:val="19"/>
+              </w:rPr>
+              <w:t>Wagi rodzajów milczenia</w:t>
+            </w:r>
+          </w:p>
+        </w:tc>
+        <w:tc>
+          <w:tcPr>
+            <w:tcW w:type="dxa" w:w="2381"/>
+          </w:tcPr>
+          <w:p>
+            <w:r>
+              <w:rPr>
+                <w:sz w:val="19"/>
+              </w:rPr>
+            </w:r>
+            <w:r>
+              <w:rPr>
+                <w:sz w:val="19"/>
+              </w:rPr>
+              <w:t>znormalizowane do średniej 1</w:t>
+            </w:r>
+          </w:p>
+        </w:tc>
+        <w:tc>
+          <w:tcPr>
+            <w:tcW w:type="dxa" w:w="1814"/>
+          </w:tcPr>
+          <w:p>
+            <w:r>
+              <w:rPr>
+                <w:sz w:val="19"/>
+              </w:rPr>
+            </w:r>
+            <w:r>
+              <w:rPr>
+                <w:sz w:val="19"/>
+              </w:rPr>
+              <w:t>Autorski prior</w:t>
+            </w:r>
+          </w:p>
+        </w:tc>
+        <w:tc>
+          <w:tcPr>
+            <w:tcW w:type="dxa" w:w="3061"/>
+          </w:tcPr>
+          <w:p>
+            <w:r>
+              <w:rPr>
+                <w:sz w:val="19"/>
+              </w:rPr>
+            </w:r>
+            <w:r>
+              <w:rPr>
+                <w:sz w:val="19"/>
+              </w:rPr>
+              <w:t>Przesuwają koszt między rodzajami milczenia, nie podnoszą sumy.</w:t>
+            </w:r>
+          </w:p>
+        </w:tc>
+      </w:tr>
+      <w:tr>
+        <w:tc>
+          <w:tcPr>
+            <w:tcW w:type="dxa" w:w="2268"/>
+          </w:tcPr>
+          <w:p>
+            <w:r>
+              <w:rPr>
+                <w:sz w:val="19"/>
+              </w:rPr>
+            </w:r>
+            <w:r>
+              <w:rPr>
+                <w:sz w:val="19"/>
+              </w:rPr>
+              <w:t>Stromość krzywych: pochodzenie</w:t>
+            </w:r>
+          </w:p>
+        </w:tc>
+        <w:tc>
+          <w:tcPr>
+            <w:tcW w:type="dxa" w:w="2381"/>
+          </w:tcPr>
+          <w:p>
+            <w:r>
+              <w:rPr>
+                <w:sz w:val="19"/>
+              </w:rPr>
+            </w:r>
+            <w:r>
+              <w:rPr>
+                <w:sz w:val="19"/>
+              </w:rPr>
+              <w:t>0,30 (wersja ostrożna)</w:t>
+            </w:r>
+          </w:p>
+        </w:tc>
+        <w:tc>
+          <w:tcPr>
+            <w:tcW w:type="dxa" w:w="1814"/>
+          </w:tcPr>
+          <w:p>
+            <w:r>
+              <w:rPr>
+                <w:sz w:val="19"/>
+              </w:rPr>
+            </w:r>
+            <w:r>
+              <w:rPr>
+                <w:sz w:val="19"/>
+              </w:rPr>
+              <w:t>Autorski wybór</w:t>
+            </w:r>
+          </w:p>
+        </w:tc>
+        <w:tc>
+          <w:tcPr>
+            <w:tcW w:type="dxa" w:w="3061"/>
+          </w:tcPr>
+          <w:p>
+            <w:r>
+              <w:rPr>
+                <w:sz w:val="19"/>
+              </w:rPr>
+            </w:r>
+            <w:r>
+              <w:rPr>
+                <w:sz w:val="19"/>
+              </w:rPr>
+              <w:t>Wartość wyjściowa silnika była dobrana tak, by sumy zbliżały się do liczb z rozprawy autora. To nie jest wynik pomiaru.</w:t>
             </w:r>
           </w:p>
         </w:tc>
@@ -1804,6 +1952,75 @@
     </w:p>
     <w:p>
       <w:pPr>
+        <w:pStyle w:val="Heading1"/>
+      </w:pPr>
+      <w:r>
+        <w:t>7. Korekta modelu z 3 października 2026 r.</w:t>
+      </w:r>
+    </w:p>
+    <w:p>
+      <w:r>
+        <w:t>Przegląd modelu wykazał cztery błędy logiki, niezależne od wartości współczynników. Zostały poprawione; kwota firmy przykładowej spadła z 3,32 do 3,12 mln zł.</w:t>
+      </w:r>
+    </w:p>
+    <w:p>
+      <w:pPr>
+        <w:pStyle w:val="ListBullet"/>
+      </w:pPr>
+      <w:r>
+        <w:rPr>
+          <w:b/>
+        </w:rPr>
+        <w:t>Rotacja.</w:t>
+      </w:r>
+      <w:r>
+        <w:t xml:space="preserve"> Opis mówił o połączeniu 50% sygnału klimatu i 50% nadwyżki deklarowanej rotacji ponad 14,8%. W rachunku ta druga połowa znosiła się przy odejmowaniu poziomu odniesienia, więc deklaracja prawie nie wpływała na wynik. Teraz model i opis mówią to samo: połowa sygnału klimatu, a deklaracja jest tylko górnym ograniczeniem.</w:t>
+      </w:r>
+    </w:p>
+    <w:p>
+      <w:pPr>
+        <w:pStyle w:val="ListBullet"/>
+      </w:pPr>
+      <w:r>
+        <w:rPr>
+          <w:b/>
+        </w:rPr>
+        <w:t>Braki danych.</w:t>
+      </w:r>
+      <w:r>
+        <w:t xml:space="preserve"> Brak rotacji był liczony inną ścieżką i dawał wyższą kwotę niż deklaracja równa odniesieniu; brak klimatu był liczony jak klimat 0. Teraz brak rotacji oznacza odniesienie 14,8%, a brak klimatu zatrzymuje obliczenie.</w:t>
+      </w:r>
+    </w:p>
+    <w:p>
+      <w:pPr>
+        <w:pStyle w:val="ListBullet"/>
+      </w:pPr>
+      <w:r>
+        <w:rPr>
+          <w:b/>
+        </w:rPr>
+        <w:t>Obwinianie liczone dwa razy</w:t>
+      </w:r>
+      <w:r>
+        <w:t xml:space="preserve"> w obszarze błędów (w stopie ukrywania i jako osobne wzmocnienie). Wzmocnienie usunięto.</w:t>
+      </w:r>
+    </w:p>
+    <w:p>
+      <w:pPr>
+        <w:pStyle w:val="ListBullet"/>
+      </w:pPr>
+      <w:r>
+        <w:rPr>
+          <w:b/>
+        </w:rPr>
+        <w:t>Wagi rodzajów milczenia</w:t>
+      </w:r>
+      <w:r>
+        <w:t xml:space="preserve"> działały jak stały mnożnik (wypalenie było przez to wyższe o około 14%). Teraz są znormalizowane.</w:t>
+      </w:r>
+    </w:p>
+    <w:p>
+      <w:pPr>
         <w:pStyle w:val="Heading2"/>
       </w:pPr>
       <w:r>

</xml_diff>